<commit_message>
Update architecture document to reflect creator-based task lookup
</commit_message>
<xml_diff>
--- a/DefectLens_Architecture_Document.docx
+++ b/DefectLens_Architecture_Document.docx
@@ -282,7 +282,7 @@
         <w:pStyle w:val="ListBullet2"/>
       </w:pPr>
       <w:r>
-        <w:t>Multi-Task Review — Review single tasks, multiple tasks, or all open tasks by owner with date filtering.</w:t>
+        <w:t>Multi-Task Review — Review single tasks, multiple tasks, or all open tasks by creator with date filtering.</w:t>
       </w:r>
     </w:p>
     <w:p>
@@ -392,7 +392,7 @@
     </w:p>
     <w:p>
       <w:r>
-        <w:t>The main application file containing all UI logic, API integrations, and data processing. Built with Streamlit framework for rapid prototyping of data-centric web apps. Handles three review modes: Single Task, Multiple Tasks, and All Open Tasks by Owner.</w:t>
+        <w:t>The main application file containing all UI logic, API integrations, and data processing. Built with Streamlit framework for rapid prototyping of data-centric web apps. Handles three review modes: Single Task, Multiple Tasks, and All Open Tasks by Creator.</w:t>
       </w:r>
     </w:p>
     <w:p>
@@ -405,7 +405,7 @@
     </w:p>
     <w:p>
       <w:r>
-        <w:t>Interfaces with Meta Phabricator via the jf graphql CLI. Fetches task details including title, description, creator, tags, and status. For batch mode, uses PowerSearch API (task_search_query) to find open tasks by owner with date range filtering.</w:t>
+        <w:t>Interfaces with Meta Phabricator via the jf graphql CLI. Fetches task details including title, description, creator, tags, and status. For batch mode, uses PowerSearch API (task_search_query) to find open tasks by creator with date range filtering.</w:t>
       </w:r>
     </w:p>
     <w:p>
@@ -469,7 +469,7 @@
     </w:p>
     <w:p>
       <w:r>
-        <w:t>1. User enters task number(s) or owner unixname.</w:t>
+        <w:t>1. User enters task number(s) or creator unixname.</w:t>
       </w:r>
     </w:p>
     <w:p>
@@ -1026,12 +1026,12 @@
         <w:pStyle w:val="Heading3"/>
       </w:pPr>
       <w:r>
-        <w:t>All Open Tasks by Owner</w:t>
+        <w:t>All Open Tasks by Creator</w:t>
       </w:r>
     </w:p>
     <w:p>
       <w:r>
-        <w:t>Enter an owner's unixname to fetch all their open tasks from Phabricator. Filter by date range (7, 14, 30, 60, 90, 180 days, or all time) and set a maximum task count (5-50). Tasks appear as checkboxes — use "Select all" to toggle all, or pick individual tasks. Only selected tasks are reviewed when you click the review button.</w:t>
+        <w:t>Enter a creator's unixname to fetch all their open tasks from Phabricator. Filter by date range (7, 14, 30, 60, 90, 180 days, or all time) and set a maximum task count (5-50). Tasks appear as checkboxes — use "Select all" to toggle all, or pick individual tasks. Only selected tasks are reviewed when you click the review button.</w:t>
       </w:r>
     </w:p>
     <w:p>
@@ -1404,7 +1404,7 @@
           </w:tcPr>
           <w:p>
             <w:r>
-              <w:t>Search open tasks by owner with date range filter</w:t>
+              <w:t>Search open tasks by creator with date range filter</w:t>
             </w:r>
           </w:p>
         </w:tc>

</xml_diff>

<commit_message>
Remove Meta name and personal references from all documents
</commit_message>
<xml_diff>
--- a/DefectLens_Architecture_Document.docx
+++ b/DefectLens_Architecture_Document.docx
@@ -38,7 +38,7 @@
         <w:rPr>
           <w:sz w:val="24"/>
         </w:rPr>
-        <w:t>Meta Internal Tool</w:t>
+        <w:t>Internal Tool</w:t>
         <w:br/>
       </w:r>
       <w:r>
@@ -47,13 +47,6 @@
         </w:rPr>
         <w:t>Powered by MetaGen &amp; Llama</w:t>
         <w:br/>
-        <w:br/>
-      </w:r>
-      <w:r>
-        <w:rPr>
-          <w:sz w:val="22"/>
-        </w:rPr>
-        <w:t>Author: Vasu Gautam (vgautam)</w:t>
         <w:br/>
       </w:r>
       <w:r>
@@ -234,7 +227,7 @@
     </w:p>
     <w:p>
       <w:r>
-        <w:t>DefectLens is a Meta-internal bug report review tool that helps QA engineers and developers evaluate the completeness of Phabricator tasks. It uses AI (MetaGen/Llama) to analyze bug reports against configurable checklists, verify mandatory tags, parse log files for error signals, and suggest improved defect titles.</w:t>
+        <w:t>DefectLens is a bug report review tool that helps QA engineers and developers evaluate the completeness of Phabricator tasks. It uses AI (MetaGen/Llama) to analyze bug reports against configurable checklists, verify mandatory tags, parse log files for error signals, and suggest improved defect titles.</w:t>
       </w:r>
     </w:p>
     <w:p>
@@ -327,7 +320,7 @@
     </w:p>
     <w:p>
       <w:r>
-        <w:t>DefectLens is a single-page Streamlit web application that integrates with multiple Meta-internal services and AI providers. The application runs locally on the user's machine or on a shared devserver.</w:t>
+        <w:t>DefectLens is a single-page Streamlit web application that integrates with multiple internal services and AI providers. The application runs locally on the user's machine or on a shared devserver.</w:t>
       </w:r>
     </w:p>
     <w:p/>
@@ -405,7 +398,7 @@
     </w:p>
     <w:p>
       <w:r>
-        <w:t>Interfaces with Meta Phabricator via the jf graphql CLI. Fetches task details including title, description, creator, tags, and status. For batch mode, uses PowerSearch API (task_search_query) to find open tasks by creator with date range filtering.</w:t>
+        <w:t>Interfaces with Phabricator via the jf graphql CLI. Fetches task details including title, description, creator, tags, and status. For batch mode, uses PowerSearch API (task_search_query) to find open tasks by creator with date range filtering.</w:t>
       </w:r>
     </w:p>
     <w:p>
@@ -786,7 +779,7 @@
         <w:pStyle w:val="ListBullet"/>
       </w:pPr>
       <w:r>
-        <w:t>jf CLI (for Phabricator integration) — pre-installed on Meta laptops</w:t>
+        <w:t>jf CLI (for Phabricator integration)</w:t>
       </w:r>
     </w:p>
     <w:p>
@@ -802,7 +795,7 @@
         <w:pStyle w:val="ListBullet"/>
       </w:pPr>
       <w:r>
-        <w:t>Meta VPN (for MetaGen API access) or Ollama installed locally</w:t>
+        <w:t>VPN (for MetaGen API access) or Ollama installed locally</w:t>
       </w:r>
     </w:p>
     <w:p>
@@ -884,7 +877,7 @@
         <w:pStyle w:val="ListNumber"/>
       </w:pPr>
       <w:r>
-        <w:t>Connect to Meta VPN.</w:t>
+        <w:t>Connect to VPN.</w:t>
       </w:r>
     </w:p>
     <w:p>

</xml_diff>